<commit_message>
Final version tag added
</commit_message>
<xml_diff>
--- a/deliverables/Final Deliverables/SURIMI_D3.3_ABM_final.docx
+++ b/deliverables/Final Deliverables/SURIMI_D3.3_ABM_final.docx
@@ -57,7 +57,10 @@
             <w:pStyle w:val="Subtitle"/>
           </w:pPr>
           <w:r>
-            <w:t>31 October 2026 | Version 0</w:t>
+            <w:t xml:space="preserve">31 October 2026 | </w:t>
+          </w:r>
+          <w:r>
+            <w:t>Final Version</w:t>
           </w:r>
         </w:p>
         <w:p>
@@ -436,6 +439,9 @@
             <w:pPr>
               <w:cnfStyle w:val="000000100000" w:firstRow="0" w:lastRow="0" w:firstColumn="0" w:lastColumn="0" w:oddVBand="0" w:evenVBand="0" w:oddHBand="1" w:evenHBand="0" w:firstRowFirstColumn="0" w:firstRowLastColumn="0" w:lastRowFirstColumn="0" w:lastRowLastColumn="0"/>
             </w:pPr>
+            <w:r>
+              <w:t>30 October 2026</w:t>
+            </w:r>
           </w:p>
         </w:tc>
       </w:tr>
@@ -896,10 +902,7 @@
         <w:jc w:val="both"/>
       </w:pPr>
       <w:r>
-        <w:t>POSEIDON is the agent-based model of the SURIMI toolbox. It represents fishing fleets as individual vessels that decide where to fish, adapt to changes in biomass and regulations, and report their catches, sales and fishing activity to the other SURIMI models. For SURIMI, POSEIDON was rebuilt as a modular platform that can run either on its own or as one component of the SURIMI model ensemble, driven by the SURIMI Controller. This document describes the model's purpose (§1), how it exchanges information wit</w:t>
-      </w:r>
-      <w:r>
-        <w:t>h the other models over the course of a simulation (§2), and its inputs (§3) and outputs (§4), using the North-Western Mediterranean scenario, which covers the Spanish bottom trawl and purse-seine fleets, as the example.</w:t>
+        <w:t>POSEIDON is the agent-based model of the SURIMI toolbox. It represents fishing fleets as individual vessels that decide where to fish, adapt to changes in biomass and regulations, and report their catches, sales and fishing activity to the other SURIMI models. For SURIMI, POSEIDON was rebuilt as a modular platform that can run either on its own or as one component of the SURIMI model ensemble, driven by the SURIMI Controller. This document describes the model's purpose (§1), how it exchanges information with the other models over the course of a simulation (§2), and its inputs (§3) and outputs (§4), using the North-Western Mediterranean scenario, which covers the Spanish bottom trawl and purse-seine fleets, as the example.</w:t>
       </w:r>
     </w:p>
     <w:p/>
@@ -2314,13 +2317,7 @@
         <w:jc w:val="both"/>
       </w:pPr>
       <w:r>
-        <w:t>As the agent-based model (ABM) of SURIMI, POSEIDON's purpose is to represent some of a case study's fishing fleets as individual vessels, so that the model captures how fishers adapt to their circumstances instead of assuming a fixed distribution of fishing effort. Vessels differ in their characteristics, such as size, gear and home port, are subject to the regulations that apply to them, and decide individually where to fish. In the North-Western Mediterranean scenario, a vessel remembers what it caught at</w:t>
-      </w:r>
-      <w:r>
-        <w:t xml:space="preserve"> each fishing ground it has fished, as well as the catches reported to it by a few partner vessels from the same port with the same gear. A vessel setting out on a trip either explores a fishing ground near the best one it knows or, more often, goes to the ground it expects to be the most profitable: the value of the catch it expects there, at the prices of its home port's market, minus the cost of the time needed to sail there and back. Fishing effort therefore moves as biomass, closures and regulations ch</w:t>
-      </w:r>
-      <w:r>
-        <w:t>ange, which is the kind of response that management strategy evaluation needs to capture.</w:t>
+        <w:t>As the agent-based model (ABM) of SURIMI, POSEIDON's purpose is to represent some of a case study's fishing fleets as individual vessels, so that the model captures how fishers adapt to their circumstances instead of assuming a fixed distribution of fishing effort. Vessels differ in their characteristics, such as size, gear and home port, are subject to the regulations that apply to them, and decide individually where to fish. In the North-Western Mediterranean scenario, a vessel remembers what it caught at each fishing ground it has fished, as well as the catches reported to it by a few partner vessels from the same port with the same gear. A vessel setting out on a trip either explores a fishing ground near the best one it knows or, more often, goes to the ground it expects to be the most profitable: the value of the catch it expects there, at the prices of its home port's market, minus the cost of the time needed to sail there and back. Fishing effort therefore moves as biomass, closures and regulations change, which is the kind of response that management strategy evaluation needs to capture.</w:t>
       </w:r>
     </w:p>
     <w:p>
@@ -2424,13 +2421,7 @@
         <w:jc w:val="both"/>
       </w:pPr>
       <w:r>
-        <w:t xml:space="preserve">POSEIDON grew through a series of applied projects, each with its own deadlines and requirements, and each adding the components and scenarios it needed. It was designed as a self-contained program that simulated the whole fishery, biology included. SURIMI requires POSEIDON to also operate as one component among several: driven step by step by the SURIMI Controller, receiving biomass from an ecosystem model and prices from a market model instead of computing them, and reporting its results in the terms and </w:t>
-      </w:r>
-      <w:r>
-        <w:t>units agreed by all models. Because these requirements touch every part of the model, POSEIDON has been rebuilt from the ground up, carrying over its concepts and the lessons of its past applications. Its founding idea of assembling scenarios from interchangeable components such as vessels, gears, behaviours, regulations, biology and markets, now runs through the whole code. A new case study therefore needs mostly configuration and data, and new code only for mechanisms POSEIDON lacks, such as the TAC regul</w:t>
-      </w:r>
-      <w:r>
-        <w:t xml:space="preserve">ations written for SURIMI, which other scenarios can then reuse. POSEIDON can still run on its own, with its own biology and markets, as in the </w:t>
+        <w:t xml:space="preserve">POSEIDON grew through a series of applied projects, each with its own deadlines and requirements, and each adding the components and scenarios it needed. It was designed as a self-contained program that simulated the whole fishery, biology included. SURIMI requires POSEIDON to also operate as one component among several: driven step by step by the SURIMI Controller, receiving biomass from an ecosystem model and prices from a market model instead of computing them, and reporting its results in the terms and units agreed by all models. Because these requirements touch every part of the model, POSEIDON has been rebuilt from the ground up, carrying over its concepts and the lessons of its past applications. Its founding idea of assembling scenarios from interchangeable components such as vessels, gears, behaviours, regulations, biology and markets, now runs through the whole code. A new case study therefore needs mostly configuration and data, and new code only for mechanisms POSEIDON lacks, such as the TAC regulations written for SURIMI, which other scenarios can then reuse. POSEIDON can still run on its own, with its own biology and markets, as in the </w:t>
       </w:r>
       <w:hyperlink r:id="rId22" w:history="1">
         <w:r>
@@ -2666,10 +2657,7 @@
         <w:jc w:val="both"/>
       </w:pPr>
       <w:r>
-        <w:t>The data flow diagram (Figure 1) shows where POSEIDON sits among the SURIMI models and what information it exchanges with them. POSEIDON represents some of the case study's fleets as individual vessels. Ecopath with Ecosim (EwE) represents the ecosystem, the environment and all the other fleets. The diagram shows the main information flows rather than the exact message routes. All exchanges pass through the SURIMI Controller; POSEIDON’s catches reach CMSY++ and the Fisheries Authority through EwE’s combined</w:t>
-      </w:r>
-      <w:r>
-        <w:t xml:space="preserve"> totals. Fishing activity is collected by the Controller for experiment outputs.</w:t>
+        <w:t>The data flow diagram (Figure 1) shows where POSEIDON sits among the SURIMI models and what information it exchanges with them. POSEIDON represents some of the case study's fleets as individual vessels. Ecopath with Ecosim (EwE) represents the ecosystem, the environment and all the other fleets. The diagram shows the main information flows rather than the exact message routes. All exchanges pass through the SURIMI Controller; POSEIDON’s catches reach CMSY++ and the Fisheries Authority through EwE’s combined totals. Fishing activity is collected by the Controller for experiment outputs.</w:t>
       </w:r>
     </w:p>
     <w:p>
@@ -2741,18 +2729,7 @@
         <w:jc w:val="both"/>
       </w:pPr>
       <w:r>
-        <w:t>The sequence diagram (Figure 2) shows the order of the exchanges between the Controller and POSEIDON. An experiment submitted through the GUI can run many simulations in parallel, typically to compare management strategies in an MSE. Because POSEIDON is stochastic, repeated runs of the same scenario also quantify variability due to the model’s stochastic behaviour. In each simulation, POSEIDON receives new regulations at the start of every year. Every month, it then receives updated prices and biomass, simu</w:t>
-      </w:r>
-      <w:r>
-        <w:t xml:space="preserve">lates the month, and reports its catches, sales and fishing activity. The biomass and catches marked "intermediate" are exchanged between EwE and POSEIDON alone: POSEIDON fishes from the biomass EwE </w:t>
-      </w:r>
-      <w:proofErr w:type="gramStart"/>
-      <w:r>
-        <w:t>has</w:t>
-      </w:r>
-      <w:proofErr w:type="gramEnd"/>
-      <w:r>
-        <w:t xml:space="preserve"> just computed, and its catches go back to EwE, which removes them from the biomass when it simulates the next month. The Fisheries Authority and CMSY++ receive EwE's totals instead, which include the catches of all fleets. Sections 3 and 4 describe each message.</w:t>
+        <w:t>The sequence diagram (Figure 2) shows the order of the exchanges between the Controller and POSEIDON. An experiment submitted through the GUI can run many simulations in parallel, typically to compare management strategies in an MSE. Because POSEIDON is stochastic, repeated runs of the same scenario also quantify variability due to the model’s stochastic behaviour. In each simulation, POSEIDON receives new regulations at the start of every year. Every month, it then receives updated prices and biomass, simulates the month, and reports its catches, sales and fishing activity. The biomass and catches marked "intermediate" are exchanged between EwE and POSEIDON alone: POSEIDON fishes from the biomass EwE has just computed, and its catches go back to EwE, which removes them from the biomass when it simulates the next month. The Fisheries Authority and CMSY++ receive EwE's totals instead, which include the catches of all fleets. Sections 3 and 4 describe each message.</w:t>
       </w:r>
     </w:p>
     <w:p>
@@ -2824,45 +2801,7 @@
         <w:jc w:val="both"/>
       </w:pPr>
       <w:r>
-        <w:t xml:space="preserve">Within each monthly step, POSEIDON simulates the fishery in continuous time, and each vessel repeats the same trip cycle. A vessel in its home port waits until it may </w:t>
-      </w:r>
-      <w:proofErr w:type="gramStart"/>
-      <w:r>
-        <w:t>leave:</w:t>
-      </w:r>
-      <w:proofErr w:type="gramEnd"/>
-      <w:r>
-        <w:t xml:space="preserve"> on a fishing day, at its fleet's usual departure time (in the evening for purse seiners, in the morning for bottom trawlers), if it has not already left that day, and only if its fleet segment has not exhausted any of its quotas. It then chooses a fishing ground as described in §1, among the cells where the regulations in force allow it to fish and that it can reach, fish and return from within its fleet's trip duration. It travels there along a path through the model grid and performs a fishing oper</w:t>
-      </w:r>
-      <w:r>
-        <w:t xml:space="preserve">ation, a set or a tow. Its catch depends on the biomass in that cell and gear- and species-specific </w:t>
-      </w:r>
-      <w:proofErr w:type="gramStart"/>
-      <w:r>
-        <w:t>catchability, and</w:t>
-      </w:r>
-      <w:proofErr w:type="gramEnd"/>
-      <w:r>
-        <w:t xml:space="preserve"> is removed from the cell’s biomass. Its discards are returned to the sea dead. The vessel records that catch and </w:t>
-      </w:r>
-      <w:proofErr w:type="gramStart"/>
-      <w:r>
-        <w:t>reports</w:t>
-      </w:r>
-      <w:proofErr w:type="gramEnd"/>
-      <w:r>
-        <w:t xml:space="preserve"> it to its partners, which updates what they all know about the fishing grounds. It then chooses its next fishing ground in the same way, except that it explores around where it is rather than around the best ground it </w:t>
-      </w:r>
-      <w:proofErr w:type="gramStart"/>
-      <w:r>
-        <w:t>knows, and</w:t>
-      </w:r>
-      <w:proofErr w:type="gramEnd"/>
-      <w:r>
-        <w:t xml:space="preserve"> leaves out the cells it has already fished d</w:t>
-      </w:r>
-      <w:r>
-        <w:t>uring the trip. It goes on fishing until no ground is left that it can reach, fish and still return from in time, then sails back to port, lands its catch and sells it at the port's market.</w:t>
+        <w:t>Within each monthly step, POSEIDON simulates the fishery in continuous time, and each vessel repeats the same trip cycle. A vessel in its home port waits until it may leave: on a fishing day, at its fleet's usual departure time (in the evening for purse seiners, in the morning for bottom trawlers), if it has not already left that day, and only if its fleet segment has not exhausted any of its quotas. It then chooses a fishing ground as described in §1, among the cells where the regulations in force allow it to fish and that it can reach, fish and return from within its fleet's trip duration. It travels there along a path through the model grid and performs a fishing operation, a set or a tow. Its catch depends on the biomass in that cell and gear- and species-specific catchability, and is removed from the cell’s biomass. Its discards are returned to the sea dead. The vessel records that catch and reports it to its partners, which updates what they all know about the fishing grounds. It then chooses its next fishing ground in the same way, except that it explores around where it is rather than around the best ground it knows, and leaves out the cells it has already fished during the trip. It goes on fishing until no ground is left that it can reach, fish and still return from in time, then sails back to port, lands its catch and sells it at the port's market.</w:t>
       </w:r>
     </w:p>
     <w:p>
@@ -2943,10 +2882,7 @@
         <w:jc w:val="both"/>
       </w:pPr>
       <w:r>
-        <w:t>The scenario represents the Spanish bottom trawlers (OTB) and purse seiners (PS) of the North-Western Mediterranean, from Cartagena to the French border, with every vessel in these fleets modelled individually. Between 2013 and 2024, 448 to 491 trawlers and 109 to 144 purse seiners were active at any one time, based in 36 ports. The modelled sea area, on a grid of 1/12° cells, covers about 55,000 km², of which about 39,000 km² lie outside the French exclusive economic zone, before other fishing restrictions</w:t>
-      </w:r>
-      <w:r>
-        <w:t xml:space="preserve"> are applied. The scenario's data cover 2013 to 2024. The start and length of a SURIMI simulation are set by the Controller (§3.2.1).</w:t>
+        <w:t>The scenario represents the Spanish bottom trawlers (OTB) and purse seiners (PS) of the North-Western Mediterranean, from Cartagena to the French border, with every vessel in these fleets modelled individually. Between 2013 and 2024, 448 to 491 trawlers and 109 to 144 purse seiners were active at any one time, based in 36 ports. The modelled sea area, on a grid of 1/12° cells, covers about 55,000 km², of which about 39,000 km² lie outside the French exclusive economic zone, before other fishing restrictions are applied. The scenario's data cover 2013 to 2024. The start and length of a SURIMI simulation are set by the Controller (§3.2.1).</w:t>
       </w:r>
     </w:p>
     <w:tbl>
@@ -4005,7 +3941,6 @@
         <w:t xml:space="preserve">, proto package </w:t>
       </w:r>
       <w:hyperlink r:id="rId40" w:history="1">
-        <w:proofErr w:type="gramStart"/>
         <w:r>
           <w:rPr>
             <w:rStyle w:val="Hyperlink"/>
@@ -4014,18 +3949,7 @@
             <w:szCs w:val="20"/>
             <w:shd w:val="clear" w:color="auto" w:fill="F2F2F2"/>
           </w:rPr>
-          <w:t>surimi.v</w:t>
-        </w:r>
-        <w:proofErr w:type="gramEnd"/>
-        <w:r>
-          <w:rPr>
-            <w:rStyle w:val="Hyperlink"/>
-            <w:rFonts w:ascii="Consolas" w:hAnsi="Consolas" w:cs="Consolas"/>
-            <w:sz w:val="20"/>
-            <w:szCs w:val="20"/>
-            <w:shd w:val="clear" w:color="auto" w:fill="F2F2F2"/>
-          </w:rPr>
-          <w:t>1</w:t>
+          <w:t>surimi.v1</w:t>
         </w:r>
       </w:hyperlink>
       <w:r>
@@ -4440,7 +4364,6 @@
               </w:rPr>
               <w:t>simulation.​items.​species</w:t>
             </w:r>
-            <w:proofErr w:type="gramStart"/>
             <w:r>
               <w:t xml:space="preserve">, </w:t>
             </w:r>
@@ -4451,9 +4374,11 @@
                 <w:szCs w:val="16"/>
                 <w:shd w:val="clear" w:color="auto" w:fill="F2F2F2"/>
               </w:rPr>
-              <w:t>.</w:t>
-            </w:r>
-            <w:proofErr w:type="gramEnd"/>
+              <w:t>.​markets</w:t>
+            </w:r>
+            <w:r>
+              <w:t xml:space="preserve">, </w:t>
+            </w:r>
             <w:r>
               <w:rPr>
                 <w:rFonts w:ascii="Consolas" w:hAnsi="Consolas" w:cs="Consolas"/>
@@ -4461,30 +4386,7 @@
                 <w:szCs w:val="16"/>
                 <w:shd w:val="clear" w:color="auto" w:fill="F2F2F2"/>
               </w:rPr>
-              <w:t>​markets</w:t>
-            </w:r>
-            <w:proofErr w:type="gramStart"/>
-            <w:r>
-              <w:t xml:space="preserve">, </w:t>
-            </w:r>
-            <w:r>
-              <w:rPr>
-                <w:rFonts w:ascii="Consolas" w:hAnsi="Consolas" w:cs="Consolas"/>
-                <w:sz w:val="16"/>
-                <w:szCs w:val="16"/>
-                <w:shd w:val="clear" w:color="auto" w:fill="F2F2F2"/>
-              </w:rPr>
-              <w:t>.</w:t>
-            </w:r>
-            <w:proofErr w:type="gramEnd"/>
-            <w:r>
-              <w:rPr>
-                <w:rFonts w:ascii="Consolas" w:hAnsi="Consolas" w:cs="Consolas"/>
-                <w:sz w:val="16"/>
-                <w:szCs w:val="16"/>
-                <w:shd w:val="clear" w:color="auto" w:fill="F2F2F2"/>
-              </w:rPr>
-              <w:t>​price_categories</w:t>
+              <w:t>.​price_categories</w:t>
             </w:r>
           </w:p>
         </w:tc>
@@ -5062,15 +4964,7 @@
           </w:tcPr>
           <w:p>
             <w:r>
-              <w:t xml:space="preserve">List of prices, each for one species, price category (e.g. "Fresh - Whole") and market (a port), </w:t>
-            </w:r>
-            <w:proofErr w:type="gramStart"/>
-            <w:r>
-              <w:t>in a given</w:t>
-            </w:r>
-            <w:proofErr w:type="gramEnd"/>
-            <w:r>
-              <w:t xml:space="preserve"> currency per unit of the contract's mass unit.</w:t>
+              <w:t>List of prices, each for one species, price category (e.g. "Fresh - Whole") and market (a port), in a given currency per unit of the contract's mass unit.</w:t>
             </w:r>
           </w:p>
         </w:tc>
@@ -5323,15 +5217,7 @@
       </w:pPr>
       <w:r>
         <w:lastRenderedPageBreak/>
-        <w:t xml:space="preserve">During the step, vessels' catches deplete the biomass where they fish. The next update replaces it with EwE's new values, which </w:t>
-      </w:r>
-      <w:proofErr w:type="gramStart"/>
-      <w:r>
-        <w:t>take into account</w:t>
-      </w:r>
-      <w:proofErr w:type="gramEnd"/>
-      <w:r>
-        <w:t xml:space="preserve"> the catches POSEIDON reported through </w:t>
+        <w:t xml:space="preserve">During the step, vessels' catches deplete the biomass where they fish. The next update replaces it with EwE's new values, which take into account the catches POSEIDON reported through </w:t>
       </w:r>
       <w:hyperlink r:id="rId58" w:anchor="surimi.v1.FisheryService.GetCatchDisposition" w:history="1">
         <w:r>
@@ -5512,15 +5398,7 @@
         <w:jc w:val="both"/>
       </w:pPr>
       <w:r>
-        <w:t xml:space="preserve">POSEIDON's outputs are requested by the Controller after each step and forwarded to the other models. Each request specifies </w:t>
-      </w:r>
-      <w:proofErr w:type="gramStart"/>
-      <w:r>
-        <w:t>a time period</w:t>
-      </w:r>
-      <w:proofErr w:type="gramEnd"/>
-      <w:r>
-        <w:t>, normally the step just simulated, and POSEIDON reports on what happened during that period. Catch and sales masses are expressed in the contract's mass unit, and, as explained in §3.2.1, only items in the contract are reported.</w:t>
+        <w:t>POSEIDON's outputs are requested by the Controller after each step and forwarded to the other models. Each request specifies a time period, normally the step just simulated, and POSEIDON reports on what happened during that period. Catch and sales masses are expressed in the contract's mass unit, and, as explained in §3.2.1, only items in the contract are reported.</w:t>
       </w:r>
     </w:p>
     <w:p>
@@ -5954,15 +5832,7 @@
         <w:jc w:val="both"/>
       </w:pPr>
       <w:r>
-        <w:t xml:space="preserve">This measures TAC-related closures only, not other fishing restrictions or the fishing effort </w:t>
-      </w:r>
-      <w:proofErr w:type="gramStart"/>
-      <w:r>
-        <w:t>actually exerted</w:t>
-      </w:r>
-      <w:proofErr w:type="gramEnd"/>
-      <w:r>
-        <w:t>.</w:t>
+        <w:t>This measures TAC-related closures only, not other fishing restrictions or the fishing effort actually exerted.</w:t>
       </w:r>
     </w:p>
     <w:p/>
@@ -6535,25 +6405,7 @@
             <w:rFonts w:asciiTheme="minorHAnsi" w:hAnsiTheme="minorHAnsi" w:cstheme="minorHAnsi"/>
             <w:color w:val="FFFFFF" w:themeColor="background1"/>
           </w:rPr>
-          <w:t>@surimi-</w:t>
-        </w:r>
-        <w:proofErr w:type="gramStart"/>
-        <w:r>
-          <w:rPr>
-            <w:rStyle w:val="Hyperlink"/>
-            <w:rFonts w:asciiTheme="minorHAnsi" w:hAnsiTheme="minorHAnsi" w:cstheme="minorHAnsi"/>
-            <w:color w:val="FFFFFF" w:themeColor="background1"/>
-          </w:rPr>
-          <w:t>project.bsky</w:t>
-        </w:r>
-        <w:proofErr w:type="gramEnd"/>
-        <w:r>
-          <w:rPr>
-            <w:rStyle w:val="Hyperlink"/>
-            <w:rFonts w:asciiTheme="minorHAnsi" w:hAnsiTheme="minorHAnsi" w:cstheme="minorHAnsi"/>
-            <w:color w:val="FFFFFF" w:themeColor="background1"/>
-          </w:rPr>
-          <w:t>.social</w:t>
+          <w:t>@surimi-project.bsky.social</w:t>
         </w:r>
       </w:hyperlink>
       <w:r>
@@ -7012,7 +6864,7 @@
             </wp:anchor>
           </w:drawing>
         </mc:Choice>
-        <mc:Fallback xmlns:a="http://schemas.openxmlformats.org/drawingml/2006/main" xmlns:pic="http://schemas.openxmlformats.org/drawingml/2006/picture" xmlns:a14="http://schemas.microsoft.com/office/drawing/2010/main">
+        <mc:Fallback xmlns:a14="http://schemas.microsoft.com/office/drawing/2010/main" xmlns:pic="http://schemas.openxmlformats.org/drawingml/2006/picture" xmlns:a="http://schemas.openxmlformats.org/drawingml/2006/main">
           <w:pict>
             <v:rect id="Rectangle 5" style="position:absolute;margin-left:-68.75pt;margin-top:177.1pt;width:615.1pt;height:14.15pt;z-index:251827712;visibility:visible;mso-wrap-style:square;mso-width-percent:0;mso-height-percent:0;mso-wrap-distance-left:9pt;mso-wrap-distance-top:0;mso-wrap-distance-right:9pt;mso-wrap-distance-bottom:0;mso-position-horizontal:absolute;mso-position-horizontal-relative:text;mso-position-vertical:absolute;mso-position-vertical-relative:text;mso-width-percent:0;mso-height-percent:0;mso-width-relative:margin;mso-height-relative:margin;v-text-anchor:middle" o:spid="_x0000_s1026" fillcolor="#f15852" stroked="f" strokeweight="1pt" w14:anchorId="27FE8BF7" o:gfxdata="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"/>
           </w:pict>
@@ -8305,6 +8157,7 @@
   <w:style w:type="character" w:default="1" w:styleId="DefaultParagraphFont">
     <w:name w:val="Default Paragraph Font"/>
     <w:uiPriority w:val="1"/>
+    <w:semiHidden/>
     <w:unhideWhenUsed/>
   </w:style>
   <w:style w:type="table" w:default="1" w:styleId="TableNormal">
@@ -9644,10 +9497,30 @@
 </file>
 
 <file path=customXml/item1.xml><?xml version="1.0" encoding="utf-8"?>
+<?mso-contentType ?>
+<FormTemplates xmlns="http://schemas.microsoft.com/sharepoint/v3/contenttype/forms">
+  <Display>DocumentLibraryForm</Display>
+  <Edit>DocumentLibraryForm</Edit>
+  <New>DocumentLibraryForm</New>
+</FormTemplates>
+</file>
+
+<file path=customXml/item2.xml><?xml version="1.0" encoding="utf-8"?>
 <b:Sources xmlns:b="http://schemas.openxmlformats.org/officeDocument/2006/bibliography" xmlns="http://schemas.openxmlformats.org/officeDocument/2006/bibliography" SelectedStyle="\APASixthEditionOfficeOnline.xsl" StyleName="APA" Version="6"/>
 </file>
 
-<file path=customXml/item2.xml><?xml version="1.0" encoding="utf-8"?>
+<file path=customXml/item3.xml><?xml version="1.0" encoding="utf-8"?>
+<p:properties xmlns:p="http://schemas.microsoft.com/office/2006/metadata/properties" xmlns:xsi="http://www.w3.org/2001/XMLSchema-instance" xmlns:pc="http://schemas.microsoft.com/office/infopath/2007/PartnerControls">
+  <documentManagement>
+    <lcf76f155ced4ddcb4097134ff3c332f xmlns="8ec8bf30-ae84-4ee6-8563-ef353822da9f">
+      <Terms xmlns="http://schemas.microsoft.com/office/infopath/2007/PartnerControls"/>
+    </lcf76f155ced4ddcb4097134ff3c332f>
+    <TaxCatchAll xmlns="c00bae5a-3b36-4533-92b3-e4089a8077bd" xsi:nil="true"/>
+  </documentManagement>
+</p:properties>
+</file>
+
+<file path=customXml/item4.xml><?xml version="1.0" encoding="utf-8"?>
 <ct:contentTypeSchema xmlns:ct="http://schemas.microsoft.com/office/2006/metadata/contentType" xmlns:ma="http://schemas.microsoft.com/office/2006/metadata/properties/metaAttributes" ct:_="" ma:_="" ma:contentTypeName="Document" ma:contentTypeID="0x0101008827DE5994703046BF5BAAA9984544DA" ma:contentTypeVersion="13" ma:contentTypeDescription="Create a new document." ma:contentTypeScope="" ma:versionID="c0d8a888f249fa3822f1351c43368e7d">
   <xsd:schema xmlns:xsd="http://www.w3.org/2001/XMLSchema" xmlns:xs="http://www.w3.org/2001/XMLSchema" xmlns:p="http://schemas.microsoft.com/office/2006/metadata/properties" xmlns:ns2="8ec8bf30-ae84-4ee6-8563-ef353822da9f" xmlns:ns3="c00bae5a-3b36-4533-92b3-e4089a8077bd" targetNamespace="http://schemas.microsoft.com/office/2006/metadata/properties" ma:root="true" ma:fieldsID="c9d04544661a3d10c547b7efaca18eb5" ns2:_="" ns3:_="">
     <xsd:import namespace="8ec8bf30-ae84-4ee6-8563-ef353822da9f"/>
@@ -9854,27 +9727,15 @@
 </ct:contentTypeSchema>
 </file>
 
-<file path=customXml/item3.xml><?xml version="1.0" encoding="utf-8"?>
-<?mso-contentType ?>
-<FormTemplates xmlns="http://schemas.microsoft.com/sharepoint/v3/contenttype/forms">
-  <Display>DocumentLibraryForm</Display>
-  <Edit>DocumentLibraryForm</Edit>
-  <New>DocumentLibraryForm</New>
-</FormTemplates>
+<file path=customXml/itemProps1.xml><?xml version="1.0" encoding="utf-8"?>
+<ds:datastoreItem xmlns:ds="http://schemas.openxmlformats.org/officeDocument/2006/customXml" ds:itemID="{50F95D34-3D48-4F65-9662-AFE39A45341E}">
+  <ds:schemaRefs>
+    <ds:schemaRef ds:uri="http://schemas.microsoft.com/sharepoint/v3/contenttype/forms"/>
+  </ds:schemaRefs>
+</ds:datastoreItem>
 </file>
 
-<file path=customXml/item4.xml><?xml version="1.0" encoding="utf-8"?>
-<p:properties xmlns:p="http://schemas.microsoft.com/office/2006/metadata/properties" xmlns:xsi="http://www.w3.org/2001/XMLSchema-instance" xmlns:pc="http://schemas.microsoft.com/office/infopath/2007/PartnerControls">
-  <documentManagement>
-    <lcf76f155ced4ddcb4097134ff3c332f xmlns="8ec8bf30-ae84-4ee6-8563-ef353822da9f">
-      <Terms xmlns="http://schemas.microsoft.com/office/infopath/2007/PartnerControls"/>
-    </lcf76f155ced4ddcb4097134ff3c332f>
-    <TaxCatchAll xmlns="c00bae5a-3b36-4533-92b3-e4089a8077bd" xsi:nil="true"/>
-  </documentManagement>
-</p:properties>
-</file>
-
-<file path=customXml/itemProps1.xml><?xml version="1.0" encoding="utf-8"?>
+<file path=customXml/itemProps2.xml><?xml version="1.0" encoding="utf-8"?>
 <ds:datastoreItem xmlns:ds="http://schemas.openxmlformats.org/officeDocument/2006/customXml" ds:itemID="{7ADB581E-5879-4DDD-88AD-E94D3DF65575}">
   <ds:schemaRefs>
     <ds:schemaRef ds:uri="http://schemas.openxmlformats.org/officeDocument/2006/bibliography"/>
@@ -9882,7 +9743,18 @@
 </ds:datastoreItem>
 </file>
 
-<file path=customXml/itemProps2.xml><?xml version="1.0" encoding="utf-8"?>
+<file path=customXml/itemProps3.xml><?xml version="1.0" encoding="utf-8"?>
+<ds:datastoreItem xmlns:ds="http://schemas.openxmlformats.org/officeDocument/2006/customXml" ds:itemID="{C80FDC1E-AEAD-4C53-B551-73D954C1A7C4}">
+  <ds:schemaRefs>
+    <ds:schemaRef ds:uri="http://schemas.microsoft.com/office/2006/metadata/properties"/>
+    <ds:schemaRef ds:uri="http://schemas.microsoft.com/office/infopath/2007/PartnerControls"/>
+    <ds:schemaRef ds:uri="8ec8bf30-ae84-4ee6-8563-ef353822da9f"/>
+    <ds:schemaRef ds:uri="c00bae5a-3b36-4533-92b3-e4089a8077bd"/>
+  </ds:schemaRefs>
+</ds:datastoreItem>
+</file>
+
+<file path=customXml/itemProps4.xml><?xml version="1.0" encoding="utf-8"?>
 <ds:datastoreItem xmlns:ds="http://schemas.openxmlformats.org/officeDocument/2006/customXml" ds:itemID="{DB525317-5CD9-43DE-B26B-391042689E36}">
   <ds:schemaRefs>
     <ds:schemaRef ds:uri="http://schemas.microsoft.com/office/2006/metadata/contentType"/>
@@ -9901,25 +9773,6 @@
 </ds:datastoreItem>
 </file>
 
-<file path=customXml/itemProps3.xml><?xml version="1.0" encoding="utf-8"?>
-<ds:datastoreItem xmlns:ds="http://schemas.openxmlformats.org/officeDocument/2006/customXml" ds:itemID="{50F95D34-3D48-4F65-9662-AFE39A45341E}">
-  <ds:schemaRefs>
-    <ds:schemaRef ds:uri="http://schemas.microsoft.com/sharepoint/v3/contenttype/forms"/>
-  </ds:schemaRefs>
-</ds:datastoreItem>
-</file>
-
-<file path=customXml/itemProps4.xml><?xml version="1.0" encoding="utf-8"?>
-<ds:datastoreItem xmlns:ds="http://schemas.openxmlformats.org/officeDocument/2006/customXml" ds:itemID="{C80FDC1E-AEAD-4C53-B551-73D954C1A7C4}">
-  <ds:schemaRefs>
-    <ds:schemaRef ds:uri="http://schemas.microsoft.com/office/2006/metadata/properties"/>
-    <ds:schemaRef ds:uri="http://schemas.microsoft.com/office/infopath/2007/PartnerControls"/>
-    <ds:schemaRef ds:uri="8ec8bf30-ae84-4ee6-8563-ef353822da9f"/>
-    <ds:schemaRef ds:uri="c00bae5a-3b36-4533-92b3-e4089a8077bd"/>
-  </ds:schemaRefs>
-</ds:datastoreItem>
-</file>
-
 <file path=docMetadata/LabelInfo.xml><?xml version="1.0" encoding="utf-8"?>
 <clbl:labelList xmlns:clbl="http://schemas.microsoft.com/office/2020/mipLabelMetadata">
   <clbl:label id="{1a153a93-eed1-45cf-b2d2-c2b4f629b282}" enabled="1" method="Privileged" siteId="{70a6eba4-9671-45d2-b83e-432e06502242}" removed="0"/>

</xml_diff>